<commit_message>
Added corrections homework 2
</commit_message>
<xml_diff>
--- a/BD_Homework_2/Report.docx
+++ b/BD_Homework_2/Report.docx
@@ -314,6 +314,54 @@
           <w:bCs/>
           <w:lang w:val="en-US"/>
         </w:rPr>
+        <w:t>;</w:t>
+      </w:r>
+    </w:p>
+    <w:p>
+      <w:pPr>
+        <w:pStyle w:val="a7"/>
+        <w:numPr>
+          <w:ilvl w:val="0"/>
+          <w:numId w:val="3"/>
+        </w:numPr>
+        <w:rPr>
+          <w:rFonts w:ascii="Times New Roman" w:hAnsi="Times New Roman" w:cs="Times New Roman"/>
+        </w:rPr>
+      </w:pPr>
+      <w:r>
+        <w:rPr>
+          <w:rFonts w:ascii="Times New Roman" w:hAnsi="Times New Roman" w:cs="Times New Roman"/>
+          <w:b/>
+          <w:bCs/>
+        </w:rPr>
+        <w:t>Содержимое заказов(</w:t>
+      </w:r>
+      <w:proofErr w:type="spellStart"/>
+      <w:r>
+        <w:rPr>
+          <w:rFonts w:ascii="Times New Roman" w:hAnsi="Times New Roman" w:cs="Times New Roman"/>
+          <w:b/>
+          <w:bCs/>
+          <w:lang w:val="en-US"/>
+        </w:rPr>
+        <w:t>Order_items</w:t>
+      </w:r>
+      <w:proofErr w:type="spellEnd"/>
+      <w:r>
+        <w:rPr>
+          <w:rFonts w:ascii="Times New Roman" w:hAnsi="Times New Roman" w:cs="Times New Roman"/>
+          <w:b/>
+          <w:bCs/>
+        </w:rPr>
+        <w:t>)</w:t>
+      </w:r>
+      <w:r>
+        <w:rPr>
+          <w:rFonts w:ascii="Times New Roman" w:hAnsi="Times New Roman" w:cs="Times New Roman"/>
+          <w:b/>
+          <w:bCs/>
+          <w:lang w:val="en-US"/>
+        </w:rPr>
         <w:t>.</w:t>
       </w:r>
     </w:p>
@@ -463,23 +511,7 @@
           <w:rFonts w:ascii="Times New Roman" w:hAnsi="Times New Roman" w:cs="Times New Roman"/>
           <w:lang w:val="en-US"/>
         </w:rPr>
-        <w:t xml:space="preserve">: </w:t>
-      </w:r>
-      <w:proofErr w:type="gramStart"/>
-      <w:r>
-        <w:rPr>
-          <w:rFonts w:ascii="Times New Roman" w:hAnsi="Times New Roman" w:cs="Times New Roman"/>
-          <w:lang w:val="en-US"/>
-        </w:rPr>
-        <w:t>VARCHAR(</w:t>
-      </w:r>
-      <w:proofErr w:type="gramEnd"/>
-      <w:r>
-        <w:rPr>
-          <w:rFonts w:ascii="Times New Roman" w:hAnsi="Times New Roman" w:cs="Times New Roman"/>
-          <w:lang w:val="en-US"/>
-        </w:rPr>
-        <w:t>50), NOT NULL</w:t>
+        <w:t>: VARCHAR(50), NOT NULL</w:t>
       </w:r>
     </w:p>
     <w:p>
@@ -688,21 +720,12 @@
         </w:rPr>
         <w:t xml:space="preserve"> </w:t>
       </w:r>
-      <w:proofErr w:type="gramStart"/>
-      <w:r>
-        <w:rPr>
-          <w:rFonts w:ascii="Times New Roman" w:hAnsi="Times New Roman" w:cs="Times New Roman"/>
-          <w:lang w:val="en-US"/>
-        </w:rPr>
-        <w:t>VARCHAR(</w:t>
-      </w:r>
-      <w:proofErr w:type="gramEnd"/>
-      <w:r>
-        <w:rPr>
-          <w:rFonts w:ascii="Times New Roman" w:hAnsi="Times New Roman" w:cs="Times New Roman"/>
-          <w:lang w:val="en-US"/>
-        </w:rPr>
-        <w:t>255), NOT NULL</w:t>
+      <w:r>
+        <w:rPr>
+          <w:rFonts w:ascii="Times New Roman" w:hAnsi="Times New Roman" w:cs="Times New Roman"/>
+          <w:lang w:val="en-US"/>
+        </w:rPr>
+        <w:t>VARCHAR(255), NOT NULL</w:t>
       </w:r>
     </w:p>
     <w:p>
@@ -756,23 +779,7 @@
           <w:rFonts w:ascii="Times New Roman" w:hAnsi="Times New Roman" w:cs="Times New Roman"/>
           <w:lang w:val="en-US"/>
         </w:rPr>
-        <w:t xml:space="preserve"> </w:t>
-      </w:r>
-      <w:proofErr w:type="gramStart"/>
-      <w:r>
-        <w:rPr>
-          <w:rFonts w:ascii="Times New Roman" w:hAnsi="Times New Roman" w:cs="Times New Roman"/>
-          <w:lang w:val="en-US"/>
-        </w:rPr>
-        <w:t>NUMERIC(</w:t>
-      </w:r>
-      <w:proofErr w:type="gramEnd"/>
-      <w:r>
-        <w:rPr>
-          <w:rFonts w:ascii="Times New Roman" w:hAnsi="Times New Roman" w:cs="Times New Roman"/>
-          <w:lang w:val="en-US"/>
-        </w:rPr>
-        <w:t>10, 2), NOT NULL</w:t>
+        <w:t xml:space="preserve"> NUMERIC(10, 2), NOT NULL</w:t>
       </w:r>
     </w:p>
     <w:p>
@@ -884,23 +891,7 @@
           <w:rFonts w:ascii="Times New Roman" w:hAnsi="Times New Roman" w:cs="Times New Roman"/>
           <w:lang w:val="en-US"/>
         </w:rPr>
-        <w:t>) REFERENCES Product_</w:t>
-      </w:r>
-      <w:proofErr w:type="gramStart"/>
-      <w:r>
-        <w:rPr>
-          <w:rFonts w:ascii="Times New Roman" w:hAnsi="Times New Roman" w:cs="Times New Roman"/>
-          <w:lang w:val="en-US"/>
-        </w:rPr>
-        <w:t>category(</w:t>
-      </w:r>
-      <w:proofErr w:type="gramEnd"/>
-      <w:r>
-        <w:rPr>
-          <w:rFonts w:ascii="Times New Roman" w:hAnsi="Times New Roman" w:cs="Times New Roman"/>
-          <w:lang w:val="en-US"/>
-        </w:rPr>
-        <w:t>Category_id)</w:t>
+        <w:t>) REFERENCES Product_category(Category_id)</w:t>
       </w:r>
     </w:p>
     <w:p>
@@ -1047,23 +1038,7 @@
           <w:rFonts w:ascii="Times New Roman" w:hAnsi="Times New Roman" w:cs="Times New Roman"/>
           <w:lang w:val="en-US"/>
         </w:rPr>
-        <w:t xml:space="preserve">: </w:t>
-      </w:r>
-      <w:proofErr w:type="gramStart"/>
-      <w:r>
-        <w:rPr>
-          <w:rFonts w:ascii="Times New Roman" w:hAnsi="Times New Roman" w:cs="Times New Roman"/>
-          <w:lang w:val="en-US"/>
-        </w:rPr>
-        <w:t>VARCHAR(</w:t>
-      </w:r>
-      <w:proofErr w:type="gramEnd"/>
-      <w:r>
-        <w:rPr>
-          <w:rFonts w:ascii="Times New Roman" w:hAnsi="Times New Roman" w:cs="Times New Roman"/>
-          <w:lang w:val="en-US"/>
-        </w:rPr>
-        <w:t>100), NOT NULL</w:t>
+        <w:t>: VARCHAR(100), NOT NULL</w:t>
       </w:r>
     </w:p>
     <w:p>
@@ -1092,23 +1067,7 @@
           <w:rFonts w:ascii="Times New Roman" w:hAnsi="Times New Roman" w:cs="Times New Roman"/>
           <w:lang w:val="en-US"/>
         </w:rPr>
-        <w:t xml:space="preserve">: </w:t>
-      </w:r>
-      <w:proofErr w:type="gramStart"/>
-      <w:r>
-        <w:rPr>
-          <w:rFonts w:ascii="Times New Roman" w:hAnsi="Times New Roman" w:cs="Times New Roman"/>
-          <w:lang w:val="en-US"/>
-        </w:rPr>
-        <w:t>VARCHAR(</w:t>
-      </w:r>
-      <w:proofErr w:type="gramEnd"/>
-      <w:r>
-        <w:rPr>
-          <w:rFonts w:ascii="Times New Roman" w:hAnsi="Times New Roman" w:cs="Times New Roman"/>
-          <w:lang w:val="en-US"/>
-        </w:rPr>
-        <w:t>100), NOT NULL</w:t>
+        <w:t>: VARCHAR(100), NOT NULL</w:t>
       </w:r>
     </w:p>
     <w:p>
@@ -1128,23 +1087,7 @@
           <w:rFonts w:ascii="Times New Roman" w:hAnsi="Times New Roman" w:cs="Times New Roman"/>
           <w:lang w:val="en-US"/>
         </w:rPr>
-        <w:t xml:space="preserve">Email: </w:t>
-      </w:r>
-      <w:proofErr w:type="gramStart"/>
-      <w:r>
-        <w:rPr>
-          <w:rFonts w:ascii="Times New Roman" w:hAnsi="Times New Roman" w:cs="Times New Roman"/>
-          <w:lang w:val="en-US"/>
-        </w:rPr>
-        <w:t>VARCHAR(</w:t>
-      </w:r>
-      <w:proofErr w:type="gramEnd"/>
-      <w:r>
-        <w:rPr>
-          <w:rFonts w:ascii="Times New Roman" w:hAnsi="Times New Roman" w:cs="Times New Roman"/>
-          <w:lang w:val="en-US"/>
-        </w:rPr>
-        <w:t>255), NOT NULL, UNIQUE</w:t>
+        <w:t>Email: VARCHAR(255), NOT NULL, UNIQUE</w:t>
       </w:r>
     </w:p>
     <w:p>
@@ -1185,6 +1128,7 @@
           <w:rFonts w:ascii="Times New Roman" w:hAnsi="Times New Roman" w:cs="Times New Roman"/>
           <w:lang w:val="en-US"/>
         </w:rPr>
+        <w:lastRenderedPageBreak/>
         <w:t>User_pk</w:t>
       </w:r>
       <w:proofErr w:type="spellEnd"/>
@@ -1230,7 +1174,6 @@
           <w:rFonts w:ascii="Times New Roman" w:hAnsi="Times New Roman" w:cs="Times New Roman"/>
           <w:lang w:val="en-US"/>
         </w:rPr>
-        <w:lastRenderedPageBreak/>
         <w:t>User_unique</w:t>
       </w:r>
       <w:proofErr w:type="spellEnd"/>
@@ -1347,6 +1290,13 @@
         </w:rPr>
         <w:t>: INTEGER</w:t>
       </w:r>
+      <w:r>
+        <w:rPr>
+          <w:rFonts w:ascii="Times New Roman" w:hAnsi="Times New Roman" w:cs="Times New Roman"/>
+          <w:lang w:val="en-US"/>
+        </w:rPr>
+        <w:t>, PK</w:t>
+      </w:r>
     </w:p>
     <w:p>
       <w:pPr>
@@ -1360,12 +1310,21 @@
           <w:lang w:val="en-US"/>
         </w:rPr>
       </w:pPr>
-      <w:r>
-        <w:rPr>
-          <w:rFonts w:ascii="Times New Roman" w:hAnsi="Times New Roman" w:cs="Times New Roman"/>
-          <w:lang w:val="en-US"/>
-        </w:rPr>
-        <w:t>Product_id: INTEGER, FK (REFERENCES Products)</w:t>
+      <w:proofErr w:type="spellStart"/>
+      <w:r>
+        <w:rPr>
+          <w:rFonts w:ascii="Times New Roman" w:hAnsi="Times New Roman" w:cs="Times New Roman"/>
+          <w:lang w:val="en-US"/>
+        </w:rPr>
+        <w:t>Order_date</w:t>
+      </w:r>
+      <w:proofErr w:type="spellEnd"/>
+      <w:r>
+        <w:rPr>
+          <w:rFonts w:ascii="Times New Roman" w:hAnsi="Times New Roman" w:cs="Times New Roman"/>
+          <w:lang w:val="en-US"/>
+        </w:rPr>
+        <w:t>: DATE, NOT NULL</w:t>
       </w:r>
     </w:p>
     <w:p>
@@ -1401,6 +1360,26 @@
       <w:pPr>
         <w:pStyle w:val="a7"/>
         <w:numPr>
+          <w:ilvl w:val="1"/>
+          <w:numId w:val="5"/>
+        </w:numPr>
+        <w:rPr>
+          <w:rFonts w:ascii="Times New Roman" w:hAnsi="Times New Roman" w:cs="Times New Roman"/>
+          <w:lang w:val="en-US"/>
+        </w:rPr>
+      </w:pPr>
+      <w:r>
+        <w:rPr>
+          <w:rFonts w:ascii="Times New Roman" w:hAnsi="Times New Roman" w:cs="Times New Roman"/>
+          <w:lang w:val="en-US"/>
+        </w:rPr>
+        <w:t>Constraints:</w:t>
+      </w:r>
+    </w:p>
+    <w:p>
+      <w:pPr>
+        <w:pStyle w:val="a7"/>
+        <w:numPr>
           <w:ilvl w:val="2"/>
           <w:numId w:val="5"/>
         </w:numPr>
@@ -1415,6 +1394,67 @@
           <w:rFonts w:ascii="Times New Roman" w:hAnsi="Times New Roman" w:cs="Times New Roman"/>
           <w:lang w:val="en-US"/>
         </w:rPr>
+        <w:t>Orders_pk</w:t>
+      </w:r>
+      <w:proofErr w:type="spellEnd"/>
+      <w:r>
+        <w:rPr>
+          <w:rFonts w:ascii="Times New Roman" w:hAnsi="Times New Roman" w:cs="Times New Roman"/>
+          <w:lang w:val="en-US"/>
+        </w:rPr>
+        <w:t>: PRIMARY KEY (</w:t>
+      </w:r>
+      <w:proofErr w:type="spellStart"/>
+      <w:r>
+        <w:rPr>
+          <w:rFonts w:ascii="Times New Roman" w:hAnsi="Times New Roman" w:cs="Times New Roman"/>
+          <w:lang w:val="en-US"/>
+        </w:rPr>
+        <w:t>Order_id</w:t>
+      </w:r>
+      <w:proofErr w:type="spellEnd"/>
+      <w:r>
+        <w:rPr>
+          <w:rFonts w:ascii="Times New Roman" w:hAnsi="Times New Roman" w:cs="Times New Roman"/>
+          <w:lang w:val="en-US"/>
+        </w:rPr>
+        <w:t>)</w:t>
+      </w:r>
+    </w:p>
+    <w:p>
+      <w:pPr>
+        <w:pStyle w:val="a7"/>
+        <w:numPr>
+          <w:ilvl w:val="2"/>
+          <w:numId w:val="5"/>
+        </w:numPr>
+        <w:rPr>
+          <w:rFonts w:ascii="Times New Roman" w:hAnsi="Times New Roman" w:cs="Times New Roman"/>
+          <w:lang w:val="en-US"/>
+        </w:rPr>
+      </w:pPr>
+      <w:proofErr w:type="spellStart"/>
+      <w:r>
+        <w:rPr>
+          <w:rFonts w:ascii="Times New Roman" w:hAnsi="Times New Roman" w:cs="Times New Roman"/>
+          <w:lang w:val="en-US"/>
+        </w:rPr>
+        <w:t>Orders_check</w:t>
+      </w:r>
+      <w:proofErr w:type="spellEnd"/>
+      <w:r>
+        <w:rPr>
+          <w:rFonts w:ascii="Times New Roman" w:hAnsi="Times New Roman" w:cs="Times New Roman"/>
+          <w:lang w:val="en-US"/>
+        </w:rPr>
+        <w:t>: CHECK (</w:t>
+      </w:r>
+      <w:proofErr w:type="spellStart"/>
+      <w:r>
+        <w:rPr>
+          <w:rFonts w:ascii="Times New Roman" w:hAnsi="Times New Roman" w:cs="Times New Roman"/>
+          <w:lang w:val="en-US"/>
+        </w:rPr>
         <w:t>Order_date</w:t>
       </w:r>
       <w:proofErr w:type="spellEnd"/>
@@ -1423,8 +1463,98 @@
           <w:rFonts w:ascii="Times New Roman" w:hAnsi="Times New Roman" w:cs="Times New Roman"/>
           <w:lang w:val="en-US"/>
         </w:rPr>
-        <w:t>: DATE, NOT NULL</w:t>
-      </w:r>
+        <w:t xml:space="preserve"> &lt;= CURRENT_TIMESTAMP)</w:t>
+      </w:r>
+    </w:p>
+    <w:p>
+      <w:pPr>
+        <w:pStyle w:val="a7"/>
+        <w:numPr>
+          <w:ilvl w:val="2"/>
+          <w:numId w:val="5"/>
+        </w:numPr>
+        <w:rPr>
+          <w:rFonts w:ascii="Times New Roman" w:hAnsi="Times New Roman" w:cs="Times New Roman"/>
+          <w:lang w:val="en-US"/>
+        </w:rPr>
+      </w:pPr>
+      <w:proofErr w:type="spellStart"/>
+      <w:r>
+        <w:rPr>
+          <w:rFonts w:ascii="Times New Roman" w:hAnsi="Times New Roman" w:cs="Times New Roman"/>
+          <w:lang w:val="en-US"/>
+        </w:rPr>
+        <w:t>Order_user_fk</w:t>
+      </w:r>
+      <w:proofErr w:type="spellEnd"/>
+      <w:r>
+        <w:rPr>
+          <w:rFonts w:ascii="Times New Roman" w:hAnsi="Times New Roman" w:cs="Times New Roman"/>
+          <w:lang w:val="en-US"/>
+        </w:rPr>
+        <w:t>: FOREIGN KEY (</w:t>
+      </w:r>
+      <w:proofErr w:type="spellStart"/>
+      <w:r>
+        <w:rPr>
+          <w:rFonts w:ascii="Times New Roman" w:hAnsi="Times New Roman" w:cs="Times New Roman"/>
+          <w:lang w:val="en-US"/>
+        </w:rPr>
+        <w:t>User_id</w:t>
+      </w:r>
+      <w:proofErr w:type="spellEnd"/>
+      <w:r>
+        <w:rPr>
+          <w:rFonts w:ascii="Times New Roman" w:hAnsi="Times New Roman" w:cs="Times New Roman"/>
+          <w:lang w:val="en-US"/>
+        </w:rPr>
+        <w:t>) REFERENCES User (</w:t>
+      </w:r>
+      <w:proofErr w:type="spellStart"/>
+      <w:r>
+        <w:rPr>
+          <w:rFonts w:ascii="Times New Roman" w:hAnsi="Times New Roman" w:cs="Times New Roman"/>
+          <w:lang w:val="en-US"/>
+        </w:rPr>
+        <w:t>User_id</w:t>
+      </w:r>
+      <w:proofErr w:type="spellEnd"/>
+      <w:r>
+        <w:rPr>
+          <w:rFonts w:ascii="Times New Roman" w:hAnsi="Times New Roman" w:cs="Times New Roman"/>
+          <w:lang w:val="en-US"/>
+        </w:rPr>
+        <w:t>)</w:t>
+      </w:r>
+    </w:p>
+    <w:p>
+      <w:pPr>
+        <w:pStyle w:val="a7"/>
+        <w:numPr>
+          <w:ilvl w:val="0"/>
+          <w:numId w:val="5"/>
+        </w:numPr>
+        <w:rPr>
+          <w:rFonts w:ascii="Times New Roman" w:hAnsi="Times New Roman" w:cs="Times New Roman"/>
+          <w:lang w:val="en-US"/>
+        </w:rPr>
+      </w:pPr>
+      <w:r>
+        <w:rPr>
+          <w:rFonts w:ascii="Times New Roman" w:hAnsi="Times New Roman" w:cs="Times New Roman"/>
+          <w:lang w:val="en-US"/>
+        </w:rPr>
+        <w:t xml:space="preserve">Table Name: </w:t>
+      </w:r>
+      <w:proofErr w:type="spellStart"/>
+      <w:r>
+        <w:rPr>
+          <w:rFonts w:ascii="Times New Roman" w:hAnsi="Times New Roman" w:cs="Times New Roman"/>
+          <w:lang w:val="en-US"/>
+        </w:rPr>
+        <w:t>Order_items</w:t>
+      </w:r>
+      <w:proofErr w:type="spellEnd"/>
     </w:p>
     <w:p>
       <w:pPr>
@@ -1435,15 +1565,45 @@
         </w:numPr>
         <w:rPr>
           <w:rFonts w:ascii="Times New Roman" w:hAnsi="Times New Roman" w:cs="Times New Roman"/>
-          <w:lang w:val="en-US"/>
-        </w:rPr>
-      </w:pPr>
-      <w:r>
-        <w:rPr>
-          <w:rFonts w:ascii="Times New Roman" w:hAnsi="Times New Roman" w:cs="Times New Roman"/>
-          <w:lang w:val="en-US"/>
-        </w:rPr>
-        <w:t>Constraints:</w:t>
+        </w:rPr>
+      </w:pPr>
+      <w:r>
+        <w:rPr>
+          <w:rFonts w:ascii="Times New Roman" w:hAnsi="Times New Roman" w:cs="Times New Roman"/>
+          <w:lang w:val="en-US"/>
+        </w:rPr>
+        <w:t>Description</w:t>
+      </w:r>
+      <w:r>
+        <w:rPr>
+          <w:rFonts w:ascii="Times New Roman" w:hAnsi="Times New Roman" w:cs="Times New Roman"/>
+        </w:rPr>
+        <w:t xml:space="preserve">: </w:t>
+      </w:r>
+      <w:r>
+        <w:rPr>
+          <w:rFonts w:ascii="Times New Roman" w:hAnsi="Times New Roman" w:cs="Times New Roman"/>
+        </w:rPr>
+        <w:t>Содержит информацию о товарах в заказе.</w:t>
+      </w:r>
+    </w:p>
+    <w:p>
+      <w:pPr>
+        <w:pStyle w:val="a7"/>
+        <w:numPr>
+          <w:ilvl w:val="1"/>
+          <w:numId w:val="5"/>
+        </w:numPr>
+        <w:rPr>
+          <w:rFonts w:ascii="Times New Roman" w:hAnsi="Times New Roman" w:cs="Times New Roman"/>
+        </w:rPr>
+      </w:pPr>
+      <w:r>
+        <w:rPr>
+          <w:rFonts w:ascii="Times New Roman" w:hAnsi="Times New Roman" w:cs="Times New Roman"/>
+          <w:lang w:val="en-US"/>
+        </w:rPr>
+        <w:t>Attributes:</w:t>
       </w:r>
     </w:p>
     <w:p>
@@ -1464,7 +1624,7 @@
           <w:rFonts w:ascii="Times New Roman" w:hAnsi="Times New Roman" w:cs="Times New Roman"/>
           <w:lang w:val="en-US"/>
         </w:rPr>
-        <w:t>Orders_pk</w:t>
+        <w:t>Order_item_id</w:t>
       </w:r>
       <w:proofErr w:type="spellEnd"/>
       <w:r>
@@ -1472,23 +1632,7 @@
           <w:rFonts w:ascii="Times New Roman" w:hAnsi="Times New Roman" w:cs="Times New Roman"/>
           <w:lang w:val="en-US"/>
         </w:rPr>
-        <w:t>: PRIMARY KEY (</w:t>
-      </w:r>
-      <w:proofErr w:type="spellStart"/>
-      <w:r>
-        <w:rPr>
-          <w:rFonts w:ascii="Times New Roman" w:hAnsi="Times New Roman" w:cs="Times New Roman"/>
-          <w:lang w:val="en-US"/>
-        </w:rPr>
-        <w:t>Order_id</w:t>
-      </w:r>
-      <w:proofErr w:type="spellEnd"/>
-      <w:r>
-        <w:rPr>
-          <w:rFonts w:ascii="Times New Roman" w:hAnsi="Times New Roman" w:cs="Times New Roman"/>
-          <w:lang w:val="en-US"/>
-        </w:rPr>
-        <w:t>)</w:t>
+        <w:t>: INTEGER, PK</w:t>
       </w:r>
     </w:p>
     <w:p>
@@ -1509,7 +1653,7 @@
           <w:rFonts w:ascii="Times New Roman" w:hAnsi="Times New Roman" w:cs="Times New Roman"/>
           <w:lang w:val="en-US"/>
         </w:rPr>
-        <w:t>Orders_check</w:t>
+        <w:t>Order_id</w:t>
       </w:r>
       <w:proofErr w:type="spellEnd"/>
       <w:r>
@@ -1517,23 +1661,7 @@
           <w:rFonts w:ascii="Times New Roman" w:hAnsi="Times New Roman" w:cs="Times New Roman"/>
           <w:lang w:val="en-US"/>
         </w:rPr>
-        <w:t>: CHECK (</w:t>
-      </w:r>
-      <w:proofErr w:type="spellStart"/>
-      <w:r>
-        <w:rPr>
-          <w:rFonts w:ascii="Times New Roman" w:hAnsi="Times New Roman" w:cs="Times New Roman"/>
-          <w:lang w:val="en-US"/>
-        </w:rPr>
-        <w:t>Order_date</w:t>
-      </w:r>
-      <w:proofErr w:type="spellEnd"/>
-      <w:r>
-        <w:rPr>
-          <w:rFonts w:ascii="Times New Roman" w:hAnsi="Times New Roman" w:cs="Times New Roman"/>
-          <w:lang w:val="en-US"/>
-        </w:rPr>
-        <w:t xml:space="preserve"> &lt;= CURRENT_TIMESTAMP)</w:t>
+        <w:t>: INTEGER, FK (REFERENCES Orders)</w:t>
       </w:r>
     </w:p>
     <w:p>
@@ -1554,7 +1682,7 @@
           <w:rFonts w:ascii="Times New Roman" w:hAnsi="Times New Roman" w:cs="Times New Roman"/>
           <w:lang w:val="en-US"/>
         </w:rPr>
-        <w:t>Order_products_fk</w:t>
+        <w:t>Product_id</w:t>
       </w:r>
       <w:proofErr w:type="spellEnd"/>
       <w:r>
@@ -1562,23 +1690,7 @@
           <w:rFonts w:ascii="Times New Roman" w:hAnsi="Times New Roman" w:cs="Times New Roman"/>
           <w:lang w:val="en-US"/>
         </w:rPr>
-        <w:t>: FOREIGN KEY (</w:t>
-      </w:r>
-      <w:proofErr w:type="spellStart"/>
-      <w:r>
-        <w:rPr>
-          <w:rFonts w:ascii="Times New Roman" w:hAnsi="Times New Roman" w:cs="Times New Roman"/>
-          <w:lang w:val="en-US"/>
-        </w:rPr>
-        <w:t>Product_id</w:t>
-      </w:r>
-      <w:proofErr w:type="spellEnd"/>
-      <w:r>
-        <w:rPr>
-          <w:rFonts w:ascii="Times New Roman" w:hAnsi="Times New Roman" w:cs="Times New Roman"/>
-          <w:lang w:val="en-US"/>
-        </w:rPr>
-        <w:t>) REFERENCES Products (Product_id)</w:t>
+        <w:t>: INTEGER, FK (REFERENCES Products)</w:t>
       </w:r>
     </w:p>
     <w:p>
@@ -1593,13 +1705,53 @@
           <w:lang w:val="en-US"/>
         </w:rPr>
       </w:pPr>
+      <w:r>
+        <w:rPr>
+          <w:rFonts w:ascii="Times New Roman" w:hAnsi="Times New Roman" w:cs="Times New Roman"/>
+          <w:lang w:val="en-US"/>
+        </w:rPr>
+        <w:t>Quantity: INTEGER, NOT NULL</w:t>
+      </w:r>
+    </w:p>
+    <w:p>
+      <w:pPr>
+        <w:pStyle w:val="a7"/>
+        <w:numPr>
+          <w:ilvl w:val="1"/>
+          <w:numId w:val="5"/>
+        </w:numPr>
+        <w:rPr>
+          <w:rFonts w:ascii="Times New Roman" w:hAnsi="Times New Roman" w:cs="Times New Roman"/>
+          <w:lang w:val="en-US"/>
+        </w:rPr>
+      </w:pPr>
+      <w:r>
+        <w:rPr>
+          <w:rFonts w:ascii="Times New Roman" w:hAnsi="Times New Roman" w:cs="Times New Roman"/>
+          <w:lang w:val="en-US"/>
+        </w:rPr>
+        <w:t>Constraints:</w:t>
+      </w:r>
+    </w:p>
+    <w:p>
+      <w:pPr>
+        <w:pStyle w:val="a7"/>
+        <w:numPr>
+          <w:ilvl w:val="2"/>
+          <w:numId w:val="5"/>
+        </w:numPr>
+        <w:rPr>
+          <w:rFonts w:ascii="Times New Roman" w:hAnsi="Times New Roman" w:cs="Times New Roman"/>
+          <w:lang w:val="en-US"/>
+        </w:rPr>
+      </w:pPr>
       <w:proofErr w:type="spellStart"/>
       <w:r>
         <w:rPr>
           <w:rFonts w:ascii="Times New Roman" w:hAnsi="Times New Roman" w:cs="Times New Roman"/>
           <w:lang w:val="en-US"/>
         </w:rPr>
-        <w:t>Order_user_fk</w:t>
+        <w:t>Order_items_pk</w:t>
       </w:r>
       <w:proofErr w:type="spellEnd"/>
       <w:r>
@@ -1607,6 +1759,58 @@
           <w:rFonts w:ascii="Times New Roman" w:hAnsi="Times New Roman" w:cs="Times New Roman"/>
           <w:lang w:val="en-US"/>
         </w:rPr>
+        <w:t>: PRIMARY KEY</w:t>
+      </w:r>
+      <w:r>
+        <w:rPr>
+          <w:rFonts w:ascii="Times New Roman" w:hAnsi="Times New Roman" w:cs="Times New Roman"/>
+          <w:lang w:val="en-US"/>
+        </w:rPr>
+        <w:t xml:space="preserve"> (</w:t>
+      </w:r>
+      <w:proofErr w:type="spellStart"/>
+      <w:r>
+        <w:rPr>
+          <w:rFonts w:ascii="Times New Roman" w:hAnsi="Times New Roman" w:cs="Times New Roman"/>
+          <w:lang w:val="en-US"/>
+        </w:rPr>
+        <w:t>Order_item_id</w:t>
+      </w:r>
+      <w:proofErr w:type="spellEnd"/>
+      <w:r>
+        <w:rPr>
+          <w:rFonts w:ascii="Times New Roman" w:hAnsi="Times New Roman" w:cs="Times New Roman"/>
+          <w:lang w:val="en-US"/>
+        </w:rPr>
+        <w:t>)</w:t>
+      </w:r>
+    </w:p>
+    <w:p>
+      <w:pPr>
+        <w:pStyle w:val="a7"/>
+        <w:numPr>
+          <w:ilvl w:val="2"/>
+          <w:numId w:val="5"/>
+        </w:numPr>
+        <w:rPr>
+          <w:rFonts w:ascii="Times New Roman" w:hAnsi="Times New Roman" w:cs="Times New Roman"/>
+          <w:lang w:val="en-US"/>
+        </w:rPr>
+      </w:pPr>
+      <w:proofErr w:type="spellStart"/>
+      <w:r>
+        <w:rPr>
+          <w:rFonts w:ascii="Times New Roman" w:hAnsi="Times New Roman" w:cs="Times New Roman"/>
+          <w:lang w:val="en-US"/>
+        </w:rPr>
+        <w:t>Order_items_orders_fk</w:t>
+      </w:r>
+      <w:proofErr w:type="spellEnd"/>
+      <w:r>
+        <w:rPr>
+          <w:rFonts w:ascii="Times New Roman" w:hAnsi="Times New Roman" w:cs="Times New Roman"/>
+          <w:lang w:val="en-US"/>
+        </w:rPr>
         <w:t>: FOREIGN KEY (</w:t>
       </w:r>
       <w:proofErr w:type="spellStart"/>
@@ -1615,7 +1819,7 @@
           <w:rFonts w:ascii="Times New Roman" w:hAnsi="Times New Roman" w:cs="Times New Roman"/>
           <w:lang w:val="en-US"/>
         </w:rPr>
-        <w:t>User_id</w:t>
+        <w:t>Order_id</w:t>
       </w:r>
       <w:proofErr w:type="spellEnd"/>
       <w:r>
@@ -1623,7 +1827,7 @@
           <w:rFonts w:ascii="Times New Roman" w:hAnsi="Times New Roman" w:cs="Times New Roman"/>
           <w:lang w:val="en-US"/>
         </w:rPr>
-        <w:t>) REFERENCES User (</w:t>
+        <w:t>) REFERENCES Orders (</w:t>
       </w:r>
       <w:proofErr w:type="spellStart"/>
       <w:r>
@@ -1631,7 +1835,68 @@
           <w:rFonts w:ascii="Times New Roman" w:hAnsi="Times New Roman" w:cs="Times New Roman"/>
           <w:lang w:val="en-US"/>
         </w:rPr>
-        <w:t>User_id</w:t>
+        <w:t>Order_id</w:t>
+      </w:r>
+      <w:proofErr w:type="spellEnd"/>
+      <w:r>
+        <w:rPr>
+          <w:rFonts w:ascii="Times New Roman" w:hAnsi="Times New Roman" w:cs="Times New Roman"/>
+          <w:lang w:val="en-US"/>
+        </w:rPr>
+        <w:t>)</w:t>
+      </w:r>
+    </w:p>
+    <w:p>
+      <w:pPr>
+        <w:pStyle w:val="a7"/>
+        <w:numPr>
+          <w:ilvl w:val="2"/>
+          <w:numId w:val="5"/>
+        </w:numPr>
+        <w:rPr>
+          <w:rFonts w:ascii="Times New Roman" w:hAnsi="Times New Roman" w:cs="Times New Roman"/>
+          <w:lang w:val="en-US"/>
+        </w:rPr>
+      </w:pPr>
+      <w:proofErr w:type="spellStart"/>
+      <w:r>
+        <w:rPr>
+          <w:rFonts w:ascii="Times New Roman" w:hAnsi="Times New Roman" w:cs="Times New Roman"/>
+          <w:lang w:val="en-US"/>
+        </w:rPr>
+        <w:t>Order_items_products_fk</w:t>
+      </w:r>
+      <w:proofErr w:type="spellEnd"/>
+      <w:r>
+        <w:rPr>
+          <w:rFonts w:ascii="Times New Roman" w:hAnsi="Times New Roman" w:cs="Times New Roman"/>
+          <w:lang w:val="en-US"/>
+        </w:rPr>
+        <w:t>: FOREIGN KEY (</w:t>
+      </w:r>
+      <w:proofErr w:type="spellStart"/>
+      <w:r>
+        <w:rPr>
+          <w:rFonts w:ascii="Times New Roman" w:hAnsi="Times New Roman" w:cs="Times New Roman"/>
+          <w:lang w:val="en-US"/>
+        </w:rPr>
+        <w:t>Product_id</w:t>
+      </w:r>
+      <w:proofErr w:type="spellEnd"/>
+      <w:r>
+        <w:rPr>
+          <w:rFonts w:ascii="Times New Roman" w:hAnsi="Times New Roman" w:cs="Times New Roman"/>
+          <w:lang w:val="en-US"/>
+        </w:rPr>
+        <w:t>) REFERENCES Products (</w:t>
+      </w:r>
+      <w:proofErr w:type="spellStart"/>
+      <w:r>
+        <w:rPr>
+          <w:rFonts w:ascii="Times New Roman" w:hAnsi="Times New Roman" w:cs="Times New Roman"/>
+          <w:lang w:val="en-US"/>
+        </w:rPr>
+        <w:t>Product_id</w:t>
       </w:r>
       <w:proofErr w:type="spellEnd"/>
       <w:r>
@@ -1814,7 +2079,6 @@
         </w:rPr>
         <w:t>_</w:t>
       </w:r>
-      <w:proofErr w:type="gramStart"/>
       <w:r>
         <w:rPr>
           <w:rFonts w:ascii="Times New Roman" w:hAnsi="Times New Roman" w:cs="Times New Roman"/>
@@ -1838,7 +2102,6 @@
         </w:rPr>
         <w:t>Category</w:t>
       </w:r>
-      <w:proofErr w:type="gramEnd"/>
       <w:r>
         <w:rPr>
           <w:rFonts w:ascii="Times New Roman" w:hAnsi="Times New Roman" w:cs="Times New Roman"/>
@@ -1882,7 +2145,7 @@
           <w:bCs/>
           <w:lang w:val="en-US"/>
         </w:rPr>
-        <w:t>Products</w:t>
+        <w:t>User</w:t>
       </w:r>
       <w:r>
         <w:rPr>
@@ -1913,7 +2176,13 @@
         <w:rPr>
           <w:rFonts w:ascii="Times New Roman" w:hAnsi="Times New Roman" w:cs="Times New Roman"/>
         </w:rPr>
-        <w:t>Одни товар может быть продан множество раз, но каждый заказ относится к определённому товару.</w:t>
+        <w:t xml:space="preserve">Один </w:t>
+      </w:r>
+      <w:r>
+        <w:rPr>
+          <w:rFonts w:ascii="Times New Roman" w:hAnsi="Times New Roman" w:cs="Times New Roman"/>
+        </w:rPr>
+        <w:t>покупатель может сделать множество заказов, но каждый заказ будет относиться к определённому покупателю.</w:t>
       </w:r>
     </w:p>
     <w:p>
@@ -1950,7 +2219,7 @@
           <w:color w:val="8DD873" w:themeColor="accent6" w:themeTint="99"/>
           <w:lang w:val="en-US"/>
         </w:rPr>
-        <w:t>Product</w:t>
+        <w:t>User</w:t>
       </w:r>
       <w:r>
         <w:rPr>
@@ -1986,7 +2255,7 @@
           <w:color w:val="8DD873" w:themeColor="accent6" w:themeTint="99"/>
           <w:lang w:val="en-US"/>
         </w:rPr>
-        <w:t>Products</w:t>
+        <w:t>User</w:t>
       </w:r>
       <w:r>
         <w:rPr>
@@ -2001,7 +2270,7 @@
           <w:color w:val="8DD873" w:themeColor="accent6" w:themeTint="99"/>
           <w:lang w:val="en-US"/>
         </w:rPr>
-        <w:t>Product</w:t>
+        <w:t>User</w:t>
       </w:r>
       <w:r>
         <w:rPr>
@@ -2046,7 +2315,7 @@
           <w:bCs/>
           <w:lang w:val="en-US"/>
         </w:rPr>
-        <w:t>User</w:t>
+        <w:t>Orders</w:t>
       </w:r>
       <w:r>
         <w:rPr>
@@ -2054,36 +2323,46 @@
           <w:b/>
           <w:bCs/>
         </w:rPr>
-        <w:t xml:space="preserve"> и </w:t>
+        <w:t xml:space="preserve"> </w:t>
       </w:r>
       <w:r>
         <w:rPr>
           <w:rFonts w:ascii="Times New Roman" w:hAnsi="Times New Roman" w:cs="Times New Roman"/>
           <w:b/>
           <w:bCs/>
-          <w:lang w:val="en-US"/>
-        </w:rPr>
-        <w:t>Orders</w:t>
+        </w:rPr>
+        <w:t xml:space="preserve">и </w:t>
       </w:r>
       <w:r>
         <w:rPr>
           <w:rFonts w:ascii="Times New Roman" w:hAnsi="Times New Roman" w:cs="Times New Roman"/>
           <w:b/>
           <w:bCs/>
-        </w:rPr>
-        <w:t xml:space="preserve"> (Один-ко-Многим): </w:t>
-      </w:r>
-      <w:r>
-        <w:rPr>
-          <w:rFonts w:ascii="Times New Roman" w:hAnsi="Times New Roman" w:cs="Times New Roman"/>
-        </w:rPr>
-        <w:t xml:space="preserve">Один </w:t>
-      </w:r>
-      <w:r>
-        <w:rPr>
-          <w:rFonts w:ascii="Times New Roman" w:hAnsi="Times New Roman" w:cs="Times New Roman"/>
-        </w:rPr>
-        <w:t>покупатель может сделать множество заказов, но каждый заказ будет относиться к определённому покупателю.</w:t>
+          <w:lang w:val="en-US"/>
+        </w:rPr>
+        <w:t>Products</w:t>
+      </w:r>
+      <w:r>
+        <w:rPr>
+          <w:rFonts w:ascii="Times New Roman" w:hAnsi="Times New Roman" w:cs="Times New Roman"/>
+          <w:b/>
+          <w:bCs/>
+        </w:rPr>
+        <w:t xml:space="preserve"> </w:t>
+      </w:r>
+      <w:r>
+        <w:rPr>
+          <w:rFonts w:ascii="Times New Roman" w:hAnsi="Times New Roman" w:cs="Times New Roman"/>
+          <w:b/>
+          <w:bCs/>
+        </w:rPr>
+        <w:t xml:space="preserve">(Многие-ко-Многим): </w:t>
+      </w:r>
+      <w:r>
+        <w:rPr>
+          <w:rFonts w:ascii="Times New Roman" w:hAnsi="Times New Roman" w:cs="Times New Roman"/>
+        </w:rPr>
+        <w:t>Один заказ может содержать множество различных товаров, и в то же время один и тот же товар может находиться в разных заказах множества покупателей.</w:t>
       </w:r>
     </w:p>
     <w:p>
@@ -2095,8 +2374,6 @@
         </w:numPr>
         <w:rPr>
           <w:rFonts w:ascii="Times New Roman" w:hAnsi="Times New Roman" w:cs="Times New Roman"/>
-          <w:b/>
-          <w:bCs/>
         </w:rPr>
       </w:pPr>
       <w:r>
@@ -2105,6 +2382,84 @@
           <w:color w:val="8DD873" w:themeColor="accent6" w:themeTint="99"/>
           <w:lang w:val="en-US"/>
         </w:rPr>
+        <w:t>Order</w:t>
+      </w:r>
+      <w:r>
+        <w:rPr>
+          <w:rFonts w:ascii="Times New Roman" w:hAnsi="Times New Roman" w:cs="Times New Roman"/>
+          <w:color w:val="8DD873" w:themeColor="accent6" w:themeTint="99"/>
+        </w:rPr>
+        <w:t>_</w:t>
+      </w:r>
+      <w:r>
+        <w:rPr>
+          <w:rFonts w:ascii="Times New Roman" w:hAnsi="Times New Roman" w:cs="Times New Roman"/>
+          <w:color w:val="8DD873" w:themeColor="accent6" w:themeTint="99"/>
+          <w:lang w:val="en-US"/>
+        </w:rPr>
+        <w:t>items</w:t>
+      </w:r>
+      <w:r>
+        <w:rPr>
+          <w:rFonts w:ascii="Times New Roman" w:hAnsi="Times New Roman" w:cs="Times New Roman"/>
+          <w:color w:val="8DD873" w:themeColor="accent6" w:themeTint="99"/>
+        </w:rPr>
+        <w:t>.</w:t>
+      </w:r>
+      <w:r>
+        <w:rPr>
+          <w:rFonts w:ascii="Times New Roman" w:hAnsi="Times New Roman" w:cs="Times New Roman"/>
+          <w:color w:val="8DD873" w:themeColor="accent6" w:themeTint="99"/>
+          <w:lang w:val="en-US"/>
+        </w:rPr>
+        <w:t>Order</w:t>
+      </w:r>
+      <w:r>
+        <w:rPr>
+          <w:rFonts w:ascii="Times New Roman" w:hAnsi="Times New Roman" w:cs="Times New Roman"/>
+          <w:color w:val="8DD873" w:themeColor="accent6" w:themeTint="99"/>
+        </w:rPr>
+        <w:t>_</w:t>
+      </w:r>
+      <w:r>
+        <w:rPr>
+          <w:rFonts w:ascii="Times New Roman" w:hAnsi="Times New Roman" w:cs="Times New Roman"/>
+          <w:color w:val="8DD873" w:themeColor="accent6" w:themeTint="99"/>
+          <w:lang w:val="en-US"/>
+        </w:rPr>
+        <w:t>id</w:t>
+      </w:r>
+      <w:r>
+        <w:rPr>
+          <w:rFonts w:ascii="Times New Roman" w:hAnsi="Times New Roman" w:cs="Times New Roman"/>
+          <w:color w:val="8DD873" w:themeColor="accent6" w:themeTint="99"/>
+        </w:rPr>
+        <w:t xml:space="preserve"> </w:t>
+      </w:r>
+      <w:r>
+        <w:rPr>
+          <w:rFonts w:ascii="Times New Roman" w:hAnsi="Times New Roman" w:cs="Times New Roman"/>
+        </w:rPr>
+        <w:t>является</w:t>
+      </w:r>
+      <w:r>
+        <w:rPr>
+          <w:rFonts w:ascii="Times New Roman" w:hAnsi="Times New Roman" w:cs="Times New Roman"/>
+        </w:rPr>
+        <w:t xml:space="preserve"> </w:t>
+      </w:r>
+      <w:r>
+        <w:rPr>
+          <w:rFonts w:ascii="Times New Roman" w:hAnsi="Times New Roman" w:cs="Times New Roman"/>
+        </w:rPr>
+        <w:t xml:space="preserve">внешним ключом, ссылающимся на </w:t>
+      </w:r>
+      <w:r>
+        <w:rPr>
+          <w:rFonts w:ascii="Times New Roman" w:hAnsi="Times New Roman" w:cs="Times New Roman"/>
+          <w:color w:val="8DD873" w:themeColor="accent6" w:themeTint="99"/>
+          <w:lang w:val="en-US"/>
+        </w:rPr>
         <w:t>Orders</w:t>
       </w:r>
       <w:r>
@@ -2120,7 +2475,7 @@
           <w:color w:val="8DD873" w:themeColor="accent6" w:themeTint="99"/>
           <w:lang w:val="en-US"/>
         </w:rPr>
-        <w:t>User</w:t>
+        <w:t>order</w:t>
       </w:r>
       <w:r>
         <w:rPr>
@@ -2142,13 +2497,109 @@
           <w:rFonts w:ascii="Times New Roman" w:hAnsi="Times New Roman" w:cs="Times New Roman"/>
           <w:color w:val="8DD873" w:themeColor="accent6" w:themeTint="99"/>
         </w:rPr>
+        <w:t>.</w:t>
+      </w:r>
+    </w:p>
+    <w:p>
+      <w:pPr>
+        <w:pStyle w:val="a7"/>
+        <w:numPr>
+          <w:ilvl w:val="1"/>
+          <w:numId w:val="10"/>
+        </w:numPr>
+        <w:rPr>
+          <w:rFonts w:ascii="Times New Roman" w:hAnsi="Times New Roman" w:cs="Times New Roman"/>
+        </w:rPr>
+      </w:pPr>
+      <w:r>
+        <w:rPr>
+          <w:rFonts w:ascii="Times New Roman" w:hAnsi="Times New Roman" w:cs="Times New Roman"/>
+          <w:color w:val="8DD873" w:themeColor="accent6" w:themeTint="99"/>
+          <w:lang w:val="en-US"/>
+        </w:rPr>
+        <w:t>Order</w:t>
+      </w:r>
+      <w:r>
+        <w:rPr>
+          <w:rFonts w:ascii="Times New Roman" w:hAnsi="Times New Roman" w:cs="Times New Roman"/>
+          <w:color w:val="8DD873" w:themeColor="accent6" w:themeTint="99"/>
+        </w:rPr>
+        <w:t>_</w:t>
+      </w:r>
+      <w:r>
+        <w:rPr>
+          <w:rFonts w:ascii="Times New Roman" w:hAnsi="Times New Roman" w:cs="Times New Roman"/>
+          <w:color w:val="8DD873" w:themeColor="accent6" w:themeTint="99"/>
+          <w:lang w:val="en-US"/>
+        </w:rPr>
+        <w:t>items</w:t>
+      </w:r>
+      <w:r>
+        <w:rPr>
+          <w:rFonts w:ascii="Times New Roman" w:hAnsi="Times New Roman" w:cs="Times New Roman"/>
+          <w:color w:val="8DD873" w:themeColor="accent6" w:themeTint="99"/>
+        </w:rPr>
+        <w:t>.</w:t>
+      </w:r>
+      <w:r>
+        <w:rPr>
+          <w:rFonts w:ascii="Times New Roman" w:hAnsi="Times New Roman" w:cs="Times New Roman"/>
+          <w:color w:val="8DD873" w:themeColor="accent6" w:themeTint="99"/>
+          <w:lang w:val="en-US"/>
+        </w:rPr>
+        <w:t>Product</w:t>
+      </w:r>
+      <w:r>
+        <w:rPr>
+          <w:rFonts w:ascii="Times New Roman" w:hAnsi="Times New Roman" w:cs="Times New Roman"/>
+          <w:color w:val="8DD873" w:themeColor="accent6" w:themeTint="99"/>
+        </w:rPr>
+        <w:t>_</w:t>
+      </w:r>
+      <w:r>
+        <w:rPr>
+          <w:rFonts w:ascii="Times New Roman" w:hAnsi="Times New Roman" w:cs="Times New Roman"/>
+          <w:color w:val="8DD873" w:themeColor="accent6" w:themeTint="99"/>
+          <w:lang w:val="en-US"/>
+        </w:rPr>
+        <w:t>id</w:t>
+      </w:r>
+      <w:r>
+        <w:rPr>
+          <w:rFonts w:ascii="Times New Roman" w:hAnsi="Times New Roman" w:cs="Times New Roman"/>
+          <w:color w:val="8DD873" w:themeColor="accent6" w:themeTint="99"/>
+        </w:rPr>
         <w:t xml:space="preserve"> </w:t>
       </w:r>
       <w:r>
         <w:rPr>
           <w:rFonts w:ascii="Times New Roman" w:hAnsi="Times New Roman" w:cs="Times New Roman"/>
         </w:rPr>
-        <w:t xml:space="preserve">является внешним ключом, ссылающимся на </w:t>
+        <w:t>является</w:t>
+      </w:r>
+      <w:r>
+        <w:rPr>
+          <w:rFonts w:ascii="Times New Roman" w:hAnsi="Times New Roman" w:cs="Times New Roman"/>
+        </w:rPr>
+        <w:t xml:space="preserve"> </w:t>
+      </w:r>
+      <w:r>
+        <w:rPr>
+          <w:rFonts w:ascii="Times New Roman" w:hAnsi="Times New Roman" w:cs="Times New Roman"/>
+        </w:rPr>
+        <w:t>внешним</w:t>
+      </w:r>
+      <w:r>
+        <w:rPr>
+          <w:rFonts w:ascii="Times New Roman" w:hAnsi="Times New Roman" w:cs="Times New Roman"/>
+        </w:rPr>
+        <w:t xml:space="preserve"> </w:t>
+      </w:r>
+      <w:r>
+        <w:rPr>
+          <w:rFonts w:ascii="Times New Roman" w:hAnsi="Times New Roman" w:cs="Times New Roman"/>
+        </w:rPr>
+        <w:t xml:space="preserve">ключом, ссылающимся на </w:t>
       </w:r>
       <w:r>
         <w:rPr>
@@ -2156,7 +2607,7 @@
           <w:color w:val="8DD873" w:themeColor="accent6" w:themeTint="99"/>
           <w:lang w:val="en-US"/>
         </w:rPr>
-        <w:t>User</w:t>
+        <w:t>Products</w:t>
       </w:r>
       <w:r>
         <w:rPr>
@@ -2171,7 +2622,7 @@
           <w:color w:val="8DD873" w:themeColor="accent6" w:themeTint="99"/>
           <w:lang w:val="en-US"/>
         </w:rPr>
-        <w:t>User</w:t>
+        <w:t>Product</w:t>
       </w:r>
       <w:r>
         <w:rPr>
@@ -2188,13 +2639,27 @@
         </w:rPr>
         <w:t>id</w:t>
       </w:r>
-      <w:r>
-        <w:rPr>
-          <w:rFonts w:ascii="Times New Roman" w:hAnsi="Times New Roman" w:cs="Times New Roman"/>
-          <w:color w:val="8DD873" w:themeColor="accent6" w:themeTint="99"/>
-        </w:rPr>
-        <w:t>.</w:t>
-      </w:r>
+    </w:p>
+    <w:p>
+      <w:pPr>
+        <w:rPr>
+          <w:rFonts w:ascii="Times New Roman" w:hAnsi="Times New Roman" w:cs="Times New Roman"/>
+        </w:rPr>
+      </w:pPr>
+    </w:p>
+    <w:p>
+      <w:pPr>
+        <w:rPr>
+          <w:rFonts w:ascii="Times New Roman" w:hAnsi="Times New Roman" w:cs="Times New Roman"/>
+        </w:rPr>
+      </w:pPr>
+    </w:p>
+    <w:p>
+      <w:pPr>
+        <w:rPr>
+          <w:rFonts w:ascii="Times New Roman" w:hAnsi="Times New Roman" w:cs="Times New Roman"/>
+        </w:rPr>
+      </w:pPr>
     </w:p>
     <w:p>
       <w:pPr>
@@ -2212,7 +2677,7 @@
           <w:szCs w:val="32"/>
           <w:lang w:val="en-US"/>
         </w:rPr>
-        <w:t>Part 3: ER-</w:t>
+        <w:t>Part</w:t>
       </w:r>
       <w:r>
         <w:rPr>
@@ -2220,6 +2685,31 @@
           <w:sz w:val="32"/>
           <w:szCs w:val="32"/>
         </w:rPr>
+        <w:t xml:space="preserve"> 3: </w:t>
+      </w:r>
+      <w:r>
+        <w:rPr>
+          <w:rFonts w:ascii="Times New Roman" w:hAnsi="Times New Roman" w:cs="Times New Roman"/>
+          <w:sz w:val="32"/>
+          <w:szCs w:val="32"/>
+          <w:lang w:val="en-US"/>
+        </w:rPr>
+        <w:t>ER</w:t>
+      </w:r>
+      <w:r>
+        <w:rPr>
+          <w:rFonts w:ascii="Times New Roman" w:hAnsi="Times New Roman" w:cs="Times New Roman"/>
+          <w:sz w:val="32"/>
+          <w:szCs w:val="32"/>
+        </w:rPr>
+        <w:t>-</w:t>
+      </w:r>
+      <w:r>
+        <w:rPr>
+          <w:rFonts w:ascii="Times New Roman" w:hAnsi="Times New Roman" w:cs="Times New Roman"/>
+          <w:sz w:val="32"/>
+          <w:szCs w:val="32"/>
+        </w:rPr>
         <w:t>Диаграмма</w:t>
       </w:r>
     </w:p>
@@ -2235,11 +2725,14 @@
       </w:pPr>
       <w:r>
         <w:rPr>
+          <w:rFonts w:ascii="Times New Roman" w:hAnsi="Times New Roman" w:cs="Times New Roman"/>
           <w:noProof/>
+          <w:sz w:val="28"/>
+          <w:szCs w:val="28"/>
         </w:rPr>
         <w:drawing>
-          <wp:inline distT="0" distB="0" distL="0" distR="0" wp14:anchorId="2A584841" wp14:editId="1751874D">
-            <wp:extent cx="6215742" cy="3171825"/>
+          <wp:inline distT="0" distB="0" distL="0" distR="0" wp14:anchorId="64A371AB" wp14:editId="5E9C3E87">
+            <wp:extent cx="5947785" cy="4524375"/>
             <wp:effectExtent l="0" t="0" r="0" b="0"/>
             <wp:docPr id="1" name="Рисунок 1"/>
             <wp:cNvGraphicFramePr>
@@ -2249,31 +2742,22 @@
               <a:graphicData uri="http://schemas.openxmlformats.org/drawingml/2006/picture">
                 <pic:pic xmlns:pic="http://schemas.openxmlformats.org/drawingml/2006/picture">
                   <pic:nvPicPr>
-                    <pic:cNvPr id="0" name="Picture 1"/>
-                    <pic:cNvPicPr>
-                      <a:picLocks noChangeAspect="1" noChangeArrowheads="1"/>
-                    </pic:cNvPicPr>
+                    <pic:cNvPr id="1" name=""/>
+                    <pic:cNvPicPr/>
                   </pic:nvPicPr>
                   <pic:blipFill rotWithShape="1">
-                    <a:blip r:embed="rId5">
-                      <a:extLst>
-                        <a:ext uri="{28A0092B-C50C-407E-A947-70E740481C1C}">
-                          <a14:useLocalDpi xmlns:a14="http://schemas.microsoft.com/office/drawing/2010/main" val="0"/>
-                        </a:ext>
-                      </a:extLst>
-                    </a:blip>
-                    <a:srcRect t="6867" b="7716"/>
+                    <a:blip r:embed="rId5"/>
+                    <a:srcRect t="4390" b="6707"/>
                     <a:stretch/>
                   </pic:blipFill>
                   <pic:spPr bwMode="auto">
                     <a:xfrm>
                       <a:off x="0" y="0"/>
-                      <a:ext cx="6234468" cy="3181381"/>
+                      <a:ext cx="5981595" cy="4550094"/>
                     </a:xfrm>
                     <a:prstGeom prst="rect">
                       <a:avLst/>
                     </a:prstGeom>
-                    <a:noFill/>
                     <a:ln>
                       <a:noFill/>
                     </a:ln>
@@ -2306,8 +2790,15 @@
           <w:szCs w:val="32"/>
           <w:lang w:val="en-US"/>
         </w:rPr>
-        <w:lastRenderedPageBreak/>
-        <w:t xml:space="preserve">Part 4: </w:t>
+        <w:t>Part</w:t>
+      </w:r>
+      <w:r>
+        <w:rPr>
+          <w:rFonts w:ascii="Times New Roman" w:hAnsi="Times New Roman" w:cs="Times New Roman"/>
+          <w:sz w:val="32"/>
+          <w:szCs w:val="32"/>
+        </w:rPr>
+        <w:t xml:space="preserve"> 4: </w:t>
       </w:r>
       <w:r>
         <w:rPr>
@@ -2466,7 +2957,7 @@
         <w:rPr>
           <w:rFonts w:ascii="Times New Roman" w:hAnsi="Times New Roman" w:cs="Times New Roman"/>
         </w:rPr>
-        <w:t>:</w:t>
+        <w:t>;</w:t>
       </w:r>
     </w:p>
     <w:p>
@@ -2507,7 +2998,7 @@
         <w:rPr>
           <w:rFonts w:ascii="Times New Roman" w:hAnsi="Times New Roman" w:cs="Times New Roman"/>
         </w:rPr>
-        <w:t>:</w:t>
+        <w:t>;</w:t>
       </w:r>
     </w:p>
     <w:p>
@@ -2548,7 +3039,7 @@
         <w:rPr>
           <w:rFonts w:ascii="Times New Roman" w:hAnsi="Times New Roman" w:cs="Times New Roman"/>
         </w:rPr>
-        <w:t>:</w:t>
+        <w:t>.</w:t>
       </w:r>
     </w:p>
     <w:sectPr>
@@ -4441,6 +4932,7 @@
   <w:style w:type="character" w:default="1" w:styleId="a0">
     <w:name w:val="Default Paragraph Font"/>
     <w:uiPriority w:val="1"/>
+    <w:semiHidden/>
     <w:unhideWhenUsed/>
   </w:style>
   <w:style w:type="table" w:default="1" w:styleId="a1">

</xml_diff>